<commit_message>
Tighten the Stock class and Streamlit UI, and refresh analysis.docx to match the current code.
Co-authored-by: Cursor <cursoragent@cursor.com>
</commit_message>
<xml_diff>
--- a/analysis.docx
+++ b/analysis.docx
@@ -4,647 +4,149 @@
   <w:body>
     <w:p>
       <w:pPr>
-        <w:pStyle w:val="Title"/>
+        <w:pStyle w:val="Heading1"/>
       </w:pPr>
       <w:r>
-        <w:t>Assignment 1: Stock Analysis Streamlit App</w:t>
+        <w:t>Assignment 1 Analysis</w:t>
       </w:r>
     </w:p>
     <w:p>
       <w:r>
-        <w:t>Analysis and reflection: adding a second moving average to 06-streamlit-demo.py and to the Stock-based app (assignment_1.py / stock.py).</w:t>
+        <w:t>This write-up answers the four reflection questions using the actual code in demo_modified.py, stock.py, and assignment_1.py, then compares AAPL and GOOG on the Portfolio tab over the last six months.</w:t>
       </w:r>
     </w:p>
     <w:p>
       <w:pPr>
-        <w:pStyle w:val="Heading1"/>
+        <w:pStyle w:val="Heading2"/>
       </w:pPr>
       <w:r>
-        <w:t>1. What had to change, and where</w:t>
+        <w:t>1. What did you have to change in each version?</w:t>
       </w:r>
     </w:p>
     <w:p>
       <w:r>
-        <w:t>In the demo, every change went into one file. I added two sidebar sliders, computed two rolling-mean columns right after the data is downloaded, and switched the price chart from a single y column to a list of three columns. The demo had no moving average at all, so both averages were new there.</w:t>
+        <w:t xml:space="preserve">In the original demo, data work and plotting live in one script, so adding a second moving average meant editing that file in three places: two new sidebar sliders, two rolling-mean columns after the download, and a price chart that plots Close together with both averages. Those lines in </w:t>
+      </w:r>
+      <w:r>
+        <w:rPr>
+          <w:i/>
+        </w:rPr>
+        <w:t>demo_modified.py</w:t>
+      </w:r>
+      <w:r>
+        <w:t xml:space="preserve"> are:</w:t>
       </w:r>
     </w:p>
     <w:p>
-      <w:pPr>
-        <w:keepNext/>
-        <w:spacing w:after="40"/>
-      </w:pPr>
       <w:r>
         <w:rPr>
-          <w:b/>
-          <w:color w:val="444444"/>
-          <w:sz w:val="20"/>
-        </w:rPr>
-        <w:t>demo_modified.py — sidebar, calculation, and chart</w:t>
-      </w:r>
-    </w:p>
-    <w:p>
-      <w:pPr>
-        <w:keepNext/>
-        <w:spacing w:before="80" w:after="0" w:line="240" w:lineRule="auto"/>
-        <w:ind w:left="216"/>
-        <w:shd w:val="clear" w:color="auto" w:fill="F2F2F2"/>
-      </w:pPr>
-      <w:r>
-        <w:rPr>
-          <w:rFonts w:ascii="Consolas" w:hAnsi="Consolas" w:eastAsia="Consolas"/>
+          <w:rFonts w:ascii="Consolas" w:hAnsi="Consolas"/>
+          <w:color w:val="222222"/>
           <w:sz w:val="18"/>
         </w:rPr>
         <w:t>short_window = st.sidebar.slider("Short moving average (days)", 5, 200, 20)</w:t>
-      </w:r>
-    </w:p>
-    <w:p>
-      <w:pPr>
-        <w:keepNext/>
-        <w:spacing w:before="0" w:after="0" w:line="240" w:lineRule="auto"/>
-        <w:ind w:left="216"/>
-        <w:shd w:val="clear" w:color="auto" w:fill="F2F2F2"/>
-      </w:pPr>
-      <w:r>
-        <w:rPr>
-          <w:rFonts w:ascii="Consolas" w:hAnsi="Consolas" w:eastAsia="Consolas"/>
-          <w:sz w:val="18"/>
-        </w:rPr>
+        <w:br/>
         <w:t>long_window = st.sidebar.slider("Long moving average (days)", 5, 200, 50)</w:t>
       </w:r>
     </w:p>
     <w:p>
-      <w:pPr>
-        <w:keepNext/>
-        <w:spacing w:before="0" w:after="0" w:line="240" w:lineRule="auto"/>
-        <w:ind w:left="216"/>
-        <w:shd w:val="clear" w:color="auto" w:fill="F2F2F2"/>
-      </w:pPr>
       <w:r>
         <w:rPr>
-          <w:rFonts w:ascii="Consolas" w:hAnsi="Consolas" w:eastAsia="Consolas"/>
-          <w:sz w:val="18"/>
-        </w:rPr>
-        <w:t>...</w:t>
-      </w:r>
-    </w:p>
-    <w:p>
-      <w:pPr>
-        <w:keepNext/>
-        <w:spacing w:before="0" w:after="0" w:line="240" w:lineRule="auto"/>
-        <w:ind w:left="216"/>
-        <w:shd w:val="clear" w:color="auto" w:fill="F2F2F2"/>
-      </w:pPr>
-      <w:r>
-        <w:rPr>
-          <w:rFonts w:ascii="Consolas" w:hAnsi="Consolas" w:eastAsia="Consolas"/>
+          <w:rFonts w:ascii="Consolas" w:hAnsi="Consolas"/>
+          <w:color w:val="222222"/>
           <w:sz w:val="18"/>
         </w:rPr>
         <w:t>df["MA_short"] = df["Close"].rolling(window=short_window).mean()</w:t>
-      </w:r>
-    </w:p>
-    <w:p>
-      <w:pPr>
-        <w:keepNext/>
-        <w:spacing w:before="0" w:after="0" w:line="240" w:lineRule="auto"/>
-        <w:ind w:left="216"/>
-        <w:shd w:val="clear" w:color="auto" w:fill="F2F2F2"/>
-      </w:pPr>
-      <w:r>
-        <w:rPr>
-          <w:rFonts w:ascii="Consolas" w:hAnsi="Consolas" w:eastAsia="Consolas"/>
-          <w:sz w:val="18"/>
-        </w:rPr>
+        <w:br/>
         <w:t>df["MA_long"] = df["Close"].rolling(window=long_window).mean()</w:t>
       </w:r>
     </w:p>
     <w:p>
-      <w:pPr>
-        <w:keepNext/>
-        <w:spacing w:before="0" w:after="0" w:line="240" w:lineRule="auto"/>
-        <w:ind w:left="216"/>
-        <w:shd w:val="clear" w:color="auto" w:fill="F2F2F2"/>
-      </w:pPr>
       <w:r>
         <w:rPr>
-          <w:rFonts w:ascii="Consolas" w:hAnsi="Consolas" w:eastAsia="Consolas"/>
-          <w:sz w:val="18"/>
-        </w:rPr>
-        <w:t>...</w:t>
-      </w:r>
-    </w:p>
-    <w:p>
-      <w:pPr>
-        <w:keepNext/>
-        <w:spacing w:before="0" w:after="0" w:line="240" w:lineRule="auto"/>
-        <w:ind w:left="216"/>
-        <w:shd w:val="clear" w:color="auto" w:fill="F2F2F2"/>
-      </w:pPr>
-      <w:r>
-        <w:rPr>
-          <w:rFonts w:ascii="Consolas" w:hAnsi="Consolas" w:eastAsia="Consolas"/>
+          <w:rFonts w:ascii="Consolas" w:hAnsi="Consolas"/>
+          <w:color w:val="222222"/>
           <w:sz w:val="18"/>
         </w:rPr>
         <w:t>fig = px.line(</w:t>
-      </w:r>
-    </w:p>
-    <w:p>
-      <w:pPr>
-        <w:keepNext/>
-        <w:spacing w:before="0" w:after="0" w:line="240" w:lineRule="auto"/>
-        <w:ind w:left="216"/>
-        <w:shd w:val="clear" w:color="auto" w:fill="F2F2F2"/>
-      </w:pPr>
-      <w:r>
-        <w:rPr>
-          <w:rFonts w:ascii="Consolas" w:hAnsi="Consolas" w:eastAsia="Consolas"/>
-          <w:sz w:val="18"/>
-        </w:rPr>
+        <w:br/>
         <w:t xml:space="preserve">    df,</w:t>
-      </w:r>
-    </w:p>
-    <w:p>
-      <w:pPr>
-        <w:keepNext/>
-        <w:spacing w:before="0" w:after="0" w:line="240" w:lineRule="auto"/>
-        <w:ind w:left="216"/>
-        <w:shd w:val="clear" w:color="auto" w:fill="F2F2F2"/>
-      </w:pPr>
-      <w:r>
-        <w:rPr>
-          <w:rFonts w:ascii="Consolas" w:hAnsi="Consolas" w:eastAsia="Consolas"/>
-          <w:sz w:val="18"/>
-        </w:rPr>
+        <w:br/>
         <w:t xml:space="preserve">    x=df.index,</w:t>
-      </w:r>
-    </w:p>
-    <w:p>
-      <w:pPr>
-        <w:keepNext/>
-        <w:spacing w:before="0" w:after="0" w:line="240" w:lineRule="auto"/>
-        <w:ind w:left="216"/>
-        <w:shd w:val="clear" w:color="auto" w:fill="F2F2F2"/>
-      </w:pPr>
-      <w:r>
-        <w:rPr>
-          <w:rFonts w:ascii="Consolas" w:hAnsi="Consolas" w:eastAsia="Consolas"/>
-          <w:sz w:val="18"/>
-        </w:rPr>
+        <w:br/>
         <w:t xml:space="preserve">    y=["Close", "MA_short", "MA_long"],</w:t>
-      </w:r>
-    </w:p>
-    <w:p>
-      <w:pPr>
-        <w:keepNext/>
-        <w:spacing w:before="0" w:after="0" w:line="240" w:lineRule="auto"/>
-        <w:ind w:left="216"/>
-        <w:shd w:val="clear" w:color="auto" w:fill="F2F2F2"/>
-      </w:pPr>
-      <w:r>
-        <w:rPr>
-          <w:rFonts w:ascii="Consolas" w:hAnsi="Consolas" w:eastAsia="Consolas"/>
-          <w:sz w:val="18"/>
-        </w:rPr>
+        <w:br/>
         <w:t xml:space="preserve">    labels={"x": "Date", "value": "Price ($)", "variable": "Series"},</w:t>
-      </w:r>
-    </w:p>
-    <w:p>
-      <w:pPr>
-        <w:spacing w:before="0" w:after="160" w:line="240" w:lineRule="auto"/>
-        <w:ind w:left="216"/>
-        <w:shd w:val="clear" w:color="auto" w:fill="F2F2F2"/>
-      </w:pPr>
-      <w:r>
-        <w:rPr>
-          <w:rFonts w:ascii="Consolas" w:hAnsi="Consolas" w:eastAsia="Consolas"/>
-          <w:sz w:val="18"/>
-        </w:rPr>
+        <w:br/>
         <w:t>)</w:t>
       </w:r>
     </w:p>
     <w:p>
       <w:r>
-        <w:t>In my version the change was spread across two files. The calculation went into the Stock class: __init__ takes a new optional ma_long_window argument, get_data() calls _calc_ma() a second time, and _calc_ma() gained a column parameter so it can write either MA or MA_long. The app then needed a second slider, the new argument passed through the cached load_stock() function and the saved settings tuple, and one more trace in plot_price_ma().</w:t>
+        <w:t>In the class-based app I could not stop at the Streamlit file. The Stock class owns moving averages, so I added an optional long window to the initializer, reused _calc_ma with a column name, and drew the extra series from stock.data. The matching lines are:</w:t>
       </w:r>
     </w:p>
     <w:p>
-      <w:pPr>
-        <w:keepNext/>
-        <w:spacing w:after="40"/>
-      </w:pPr>
       <w:r>
         <w:rPr>
-          <w:b/>
-          <w:color w:val="444444"/>
-          <w:sz w:val="20"/>
-        </w:rPr>
-        <w:t>stock.py</w:t>
-      </w:r>
-    </w:p>
-    <w:p>
-      <w:pPr>
-        <w:keepNext/>
-        <w:spacing w:before="80" w:after="0" w:line="240" w:lineRule="auto"/>
-        <w:ind w:left="216"/>
-        <w:shd w:val="clear" w:color="auto" w:fill="F2F2F2"/>
-      </w:pPr>
-      <w:r>
-        <w:rPr>
-          <w:rFonts w:ascii="Consolas" w:hAnsi="Consolas" w:eastAsia="Consolas"/>
+          <w:rFonts w:ascii="Consolas" w:hAnsi="Consolas"/>
+          <w:color w:val="222222"/>
           <w:sz w:val="18"/>
         </w:rPr>
-        <w:t>def __init__(self, symbol, start=None, end=None, ma_window: int = 10,</w:t>
-      </w:r>
-    </w:p>
-    <w:p>
-      <w:pPr>
-        <w:keepNext/>
-        <w:spacing w:before="0" w:after="0" w:line="240" w:lineRule="auto"/>
-        <w:ind w:left="216"/>
-        <w:shd w:val="clear" w:color="auto" w:fill="F2F2F2"/>
-      </w:pPr>
-      <w:r>
-        <w:rPr>
-          <w:rFonts w:ascii="Consolas" w:hAnsi="Consolas" w:eastAsia="Consolas"/>
-          <w:sz w:val="18"/>
-        </w:rPr>
-        <w:t xml:space="preserve">             ma_long_window: int = None):</w:t>
-      </w:r>
-    </w:p>
-    <w:p>
-      <w:pPr>
-        <w:keepNext/>
-        <w:spacing w:before="0" w:after="0" w:line="240" w:lineRule="auto"/>
-        <w:ind w:left="216"/>
-        <w:shd w:val="clear" w:color="auto" w:fill="F2F2F2"/>
-      </w:pPr>
-      <w:r>
-        <w:rPr>
-          <w:rFonts w:ascii="Consolas" w:hAnsi="Consolas" w:eastAsia="Consolas"/>
-          <w:sz w:val="18"/>
-        </w:rPr>
+        <w:t>def __init__(self, symbol, start=None, end=None, ma_window=10,</w:t>
+        <w:br/>
+        <w:t xml:space="preserve">             ma_long_window=None):</w:t>
+        <w:br/>
         <w:t xml:space="preserve">    ...</w:t>
-      </w:r>
-    </w:p>
-    <w:p>
-      <w:pPr>
-        <w:keepNext/>
-        <w:spacing w:before="0" w:after="0" w:line="240" w:lineRule="auto"/>
-        <w:ind w:left="216"/>
-        <w:shd w:val="clear" w:color="auto" w:fill="F2F2F2"/>
-      </w:pPr>
-      <w:r>
-        <w:rPr>
-          <w:rFonts w:ascii="Consolas" w:hAnsi="Consolas" w:eastAsia="Consolas"/>
-          <w:sz w:val="18"/>
-        </w:rPr>
+        <w:br/>
         <w:t xml:space="preserve">    self.ma_long_window = ma_long_window</w:t>
       </w:r>
     </w:p>
     <w:p>
-      <w:pPr>
-        <w:keepNext/>
-        <w:spacing w:before="0" w:after="0" w:line="240" w:lineRule="auto"/>
-        <w:ind w:left="216"/>
-        <w:shd w:val="clear" w:color="auto" w:fill="F2F2F2"/>
-      </w:pPr>
       <w:r>
         <w:rPr>
-          <w:rFonts w:ascii="Consolas" w:hAnsi="Consolas" w:eastAsia="Consolas"/>
-          <w:sz w:val="18"/>
-        </w:rPr>
-        <w:t xml:space="preserve"> </w:t>
-      </w:r>
-    </w:p>
-    <w:p>
-      <w:pPr>
-        <w:keepNext/>
-        <w:spacing w:before="0" w:after="0" w:line="240" w:lineRule="auto"/>
-        <w:ind w:left="216"/>
-        <w:shd w:val="clear" w:color="auto" w:fill="F2F2F2"/>
-      </w:pPr>
-      <w:r>
-        <w:rPr>
-          <w:rFonts w:ascii="Consolas" w:hAnsi="Consolas" w:eastAsia="Consolas"/>
-          <w:sz w:val="18"/>
-        </w:rPr>
-        <w:t># in get_data()</w:t>
-      </w:r>
-    </w:p>
-    <w:p>
-      <w:pPr>
-        <w:keepNext/>
-        <w:spacing w:before="0" w:after="0" w:line="240" w:lineRule="auto"/>
-        <w:ind w:left="216"/>
-        <w:shd w:val="clear" w:color="auto" w:fill="F2F2F2"/>
-      </w:pPr>
-      <w:r>
-        <w:rPr>
-          <w:rFonts w:ascii="Consolas" w:hAnsi="Consolas" w:eastAsia="Consolas"/>
+          <w:rFonts w:ascii="Consolas" w:hAnsi="Consolas"/>
+          <w:color w:val="222222"/>
           <w:sz w:val="18"/>
         </w:rPr>
         <w:t>data = self._calc_ma(data, self.ma_window)</w:t>
-      </w:r>
-    </w:p>
-    <w:p>
-      <w:pPr>
-        <w:keepNext/>
-        <w:spacing w:before="0" w:after="0" w:line="240" w:lineRule="auto"/>
-        <w:ind w:left="216"/>
-        <w:shd w:val="clear" w:color="auto" w:fill="F2F2F2"/>
-      </w:pPr>
-      <w:r>
-        <w:rPr>
-          <w:rFonts w:ascii="Consolas" w:hAnsi="Consolas" w:eastAsia="Consolas"/>
-          <w:sz w:val="18"/>
-        </w:rPr>
+        <w:br/>
         <w:t>if self.ma_long_window is not None:</w:t>
-      </w:r>
-    </w:p>
-    <w:p>
-      <w:pPr>
-        <w:keepNext/>
-        <w:spacing w:before="0" w:after="0" w:line="240" w:lineRule="auto"/>
-        <w:ind w:left="216"/>
-        <w:shd w:val="clear" w:color="auto" w:fill="F2F2F2"/>
-      </w:pPr>
-      <w:r>
-        <w:rPr>
-          <w:rFonts w:ascii="Consolas" w:hAnsi="Consolas" w:eastAsia="Consolas"/>
-          <w:sz w:val="18"/>
-        </w:rPr>
+        <w:br/>
         <w:t xml:space="preserve">    data = self._calc_ma(data, self.ma_long_window, column='MA_long')</w:t>
       </w:r>
     </w:p>
     <w:p>
-      <w:pPr>
-        <w:keepNext/>
-        <w:spacing w:before="0" w:after="0" w:line="240" w:lineRule="auto"/>
-        <w:ind w:left="216"/>
-        <w:shd w:val="clear" w:color="auto" w:fill="F2F2F2"/>
-      </w:pPr>
       <w:r>
         <w:rPr>
-          <w:rFonts w:ascii="Consolas" w:hAnsi="Consolas" w:eastAsia="Consolas"/>
+          <w:rFonts w:ascii="Consolas" w:hAnsi="Consolas"/>
+          <w:color w:val="222222"/>
           <w:sz w:val="18"/>
         </w:rPr>
-        <w:t xml:space="preserve"> </w:t>
+        <w:t>def _calc_ma(self, df, window, column='MA'):</w:t>
+        <w:br/>
+        <w:t xml:space="preserve">    df[column] = df['Close'].rolling(window=window).mean()</w:t>
+        <w:br/>
+        <w:t xml:space="preserve">    return df</w:t>
       </w:r>
     </w:p>
     <w:p>
-      <w:pPr>
-        <w:keepNext/>
-        <w:spacing w:before="0" w:after="0" w:line="240" w:lineRule="auto"/>
-        <w:ind w:left="216"/>
-        <w:shd w:val="clear" w:color="auto" w:fill="F2F2F2"/>
-      </w:pPr>
       <w:r>
         <w:rPr>
-          <w:rFonts w:ascii="Consolas" w:hAnsi="Consolas" w:eastAsia="Consolas"/>
-          <w:sz w:val="18"/>
-        </w:rPr>
-        <w:t>def _calc_ma(self, df : {__setitem__,__getitem__},window, column='MA'):</w:t>
-      </w:r>
-    </w:p>
-    <w:p>
-      <w:pPr>
-        <w:spacing w:before="0" w:after="160" w:line="240" w:lineRule="auto"/>
-        <w:ind w:left="216"/>
-        <w:shd w:val="clear" w:color="auto" w:fill="F2F2F2"/>
-      </w:pPr>
-      <w:r>
-        <w:rPr>
-          <w:rFonts w:ascii="Consolas" w:hAnsi="Consolas" w:eastAsia="Consolas"/>
-          <w:sz w:val="18"/>
-        </w:rPr>
-        <w:t xml:space="preserve">    df[column] = df['Close'].rolling(window=window).mean()</w:t>
-      </w:r>
-    </w:p>
-    <w:p>
-      <w:pPr>
-        <w:keepNext/>
-        <w:spacing w:after="40"/>
-      </w:pPr>
-      <w:r>
-        <w:rPr>
-          <w:b/>
-          <w:color w:val="444444"/>
-          <w:sz w:val="20"/>
-        </w:rPr>
-        <w:t>assignment_1.py</w:t>
-      </w:r>
-    </w:p>
-    <w:p>
-      <w:pPr>
-        <w:keepNext/>
-        <w:spacing w:before="80" w:after="0" w:line="240" w:lineRule="auto"/>
-        <w:ind w:left="216"/>
-        <w:shd w:val="clear" w:color="auto" w:fill="F2F2F2"/>
-      </w:pPr>
-      <w:r>
-        <w:rPr>
-          <w:rFonts w:ascii="Consolas" w:hAnsi="Consolas" w:eastAsia="Consolas"/>
-          <w:sz w:val="18"/>
-        </w:rPr>
-        <w:t>def load_stock(symbol, start, end, ma_window, ma_long_window=None):</w:t>
-      </w:r>
-    </w:p>
-    <w:p>
-      <w:pPr>
-        <w:keepNext/>
-        <w:spacing w:before="0" w:after="0" w:line="240" w:lineRule="auto"/>
-        <w:ind w:left="216"/>
-        <w:shd w:val="clear" w:color="auto" w:fill="F2F2F2"/>
-      </w:pPr>
-      <w:r>
-        <w:rPr>
-          <w:rFonts w:ascii="Consolas" w:hAnsi="Consolas" w:eastAsia="Consolas"/>
-          <w:sz w:val="18"/>
-        </w:rPr>
-        <w:t xml:space="preserve">    return Stock(symbol, start=start, end=end, ma_window=ma_window,</w:t>
-      </w:r>
-    </w:p>
-    <w:p>
-      <w:pPr>
-        <w:keepNext/>
-        <w:spacing w:before="0" w:after="0" w:line="240" w:lineRule="auto"/>
-        <w:ind w:left="216"/>
-        <w:shd w:val="clear" w:color="auto" w:fill="F2F2F2"/>
-      </w:pPr>
-      <w:r>
-        <w:rPr>
-          <w:rFonts w:ascii="Consolas" w:hAnsi="Consolas" w:eastAsia="Consolas"/>
-          <w:sz w:val="18"/>
-        </w:rPr>
-        <w:t xml:space="preserve">                 ma_long_window=ma_long_window)</w:t>
-      </w:r>
-    </w:p>
-    <w:p>
-      <w:pPr>
-        <w:keepNext/>
-        <w:spacing w:before="0" w:after="0" w:line="240" w:lineRule="auto"/>
-        <w:ind w:left="216"/>
-        <w:shd w:val="clear" w:color="auto" w:fill="F2F2F2"/>
-      </w:pPr>
-      <w:r>
-        <w:rPr>
-          <w:rFonts w:ascii="Consolas" w:hAnsi="Consolas" w:eastAsia="Consolas"/>
-          <w:sz w:val="18"/>
-        </w:rPr>
-        <w:t xml:space="preserve"> </w:t>
-      </w:r>
-    </w:p>
-    <w:p>
-      <w:pPr>
-        <w:keepNext/>
-        <w:spacing w:before="0" w:after="0" w:line="240" w:lineRule="auto"/>
-        <w:ind w:left="216"/>
-        <w:shd w:val="clear" w:color="auto" w:fill="F2F2F2"/>
-      </w:pPr>
-      <w:r>
-        <w:rPr>
-          <w:rFonts w:ascii="Consolas" w:hAnsi="Consolas" w:eastAsia="Consolas"/>
-          <w:sz w:val="18"/>
-        </w:rPr>
-        <w:t>ma_long_window = st.sidebar.slider('Long moving average window (days)',</w:t>
-      </w:r>
-    </w:p>
-    <w:p>
-      <w:pPr>
-        <w:keepNext/>
-        <w:spacing w:before="0" w:after="0" w:line="240" w:lineRule="auto"/>
-        <w:ind w:left="216"/>
-        <w:shd w:val="clear" w:color="auto" w:fill="F2F2F2"/>
-      </w:pPr>
-      <w:r>
-        <w:rPr>
-          <w:rFonts w:ascii="Consolas" w:hAnsi="Consolas" w:eastAsia="Consolas"/>
-          <w:sz w:val="18"/>
-        </w:rPr>
-        <w:t xml:space="preserve">                                   min_value=5, max_value=200, value=50)</w:t>
-      </w:r>
-    </w:p>
-    <w:p>
-      <w:pPr>
-        <w:keepNext/>
-        <w:spacing w:before="0" w:after="0" w:line="240" w:lineRule="auto"/>
-        <w:ind w:left="216"/>
-        <w:shd w:val="clear" w:color="auto" w:fill="F2F2F2"/>
-      </w:pPr>
-      <w:r>
-        <w:rPr>
-          <w:rFonts w:ascii="Consolas" w:hAnsi="Consolas" w:eastAsia="Consolas"/>
-          <w:sz w:val="18"/>
-        </w:rPr>
-        <w:t>if ma_window &gt;= ma_long_window:</w:t>
-      </w:r>
-    </w:p>
-    <w:p>
-      <w:pPr>
-        <w:keepNext/>
-        <w:spacing w:before="0" w:after="0" w:line="240" w:lineRule="auto"/>
-        <w:ind w:left="216"/>
-        <w:shd w:val="clear" w:color="auto" w:fill="F2F2F2"/>
-      </w:pPr>
-      <w:r>
-        <w:rPr>
-          <w:rFonts w:ascii="Consolas" w:hAnsi="Consolas" w:eastAsia="Consolas"/>
-          <w:sz w:val="18"/>
-        </w:rPr>
-        <w:t xml:space="preserve">    st.sidebar.warning('Short window should be smaller than the long window.')</w:t>
-      </w:r>
-    </w:p>
-    <w:p>
-      <w:pPr>
-        <w:keepNext/>
-        <w:spacing w:before="0" w:after="0" w:line="240" w:lineRule="auto"/>
-        <w:ind w:left="216"/>
-        <w:shd w:val="clear" w:color="auto" w:fill="F2F2F2"/>
-      </w:pPr>
-      <w:r>
-        <w:rPr>
-          <w:rFonts w:ascii="Consolas" w:hAnsi="Consolas" w:eastAsia="Consolas"/>
-          <w:sz w:val="18"/>
-        </w:rPr>
-        <w:t xml:space="preserve"> </w:t>
-      </w:r>
-    </w:p>
-    <w:p>
-      <w:pPr>
-        <w:keepNext/>
-        <w:spacing w:before="0" w:after="0" w:line="240" w:lineRule="auto"/>
-        <w:ind w:left="216"/>
-        <w:shd w:val="clear" w:color="auto" w:fill="F2F2F2"/>
-      </w:pPr>
-      <w:r>
-        <w:rPr>
-          <w:rFonts w:ascii="Consolas" w:hAnsi="Consolas" w:eastAsia="Consolas"/>
-          <w:sz w:val="18"/>
-        </w:rPr>
-        <w:t>st.session_state['single_args'] = (symbol, start, end, ma_window, ma_long_window)</w:t>
-      </w:r>
-    </w:p>
-    <w:p>
-      <w:pPr>
-        <w:keepNext/>
-        <w:spacing w:before="0" w:after="0" w:line="240" w:lineRule="auto"/>
-        <w:ind w:left="216"/>
-        <w:shd w:val="clear" w:color="auto" w:fill="F2F2F2"/>
-      </w:pPr>
-      <w:r>
-        <w:rPr>
-          <w:rFonts w:ascii="Consolas" w:hAnsi="Consolas" w:eastAsia="Consolas"/>
-          <w:sz w:val="18"/>
-        </w:rPr>
-        <w:t xml:space="preserve"> </w:t>
-      </w:r>
-    </w:p>
-    <w:p>
-      <w:pPr>
-        <w:keepNext/>
-        <w:spacing w:before="0" w:after="0" w:line="240" w:lineRule="auto"/>
-        <w:ind w:left="216"/>
-        <w:shd w:val="clear" w:color="auto" w:fill="F2F2F2"/>
-      </w:pPr>
-      <w:r>
-        <w:rPr>
-          <w:rFonts w:ascii="Consolas" w:hAnsi="Consolas" w:eastAsia="Consolas"/>
+          <w:rFonts w:ascii="Consolas" w:hAnsi="Consolas"/>
+          <w:color w:val="222222"/>
           <w:sz w:val="18"/>
         </w:rPr>
         <w:t>if 'MA_long' in stock.data:</w:t>
-      </w:r>
-    </w:p>
-    <w:p>
-      <w:pPr>
-        <w:keepNext/>
-        <w:spacing w:before="0" w:after="0" w:line="240" w:lineRule="auto"/>
-        <w:ind w:left="216"/>
-        <w:shd w:val="clear" w:color="auto" w:fill="F2F2F2"/>
-      </w:pPr>
-      <w:r>
-        <w:rPr>
-          <w:rFonts w:ascii="Consolas" w:hAnsi="Consolas" w:eastAsia="Consolas"/>
-          <w:sz w:val="18"/>
-        </w:rPr>
+        <w:br/>
         <w:t xml:space="preserve">    fig.add_trace(go.Scatter(x=stock.data.index, y=stock.data['MA_long'],</w:t>
-      </w:r>
-    </w:p>
-    <w:p>
-      <w:pPr>
-        <w:spacing w:before="0" w:after="160" w:line="240" w:lineRule="auto"/>
-        <w:ind w:left="216"/>
-        <w:shd w:val="clear" w:color="auto" w:fill="F2F2F2"/>
-      </w:pPr>
-      <w:r>
-        <w:rPr>
-          <w:rFonts w:ascii="Consolas" w:hAnsi="Consolas" w:eastAsia="Consolas"/>
-          <w:sz w:val="18"/>
-        </w:rPr>
+        <w:br/>
         <w:t xml:space="preserve">                             mode='lines', name=f'{stock.ma_long_window}-day MA'))</w:t>
       </w:r>
     </w:p>
     <w:p>
       <w:pPr>
-        <w:pStyle w:val="Heading1"/>
+        <w:pStyle w:val="Heading2"/>
       </w:pPr>
       <w:r>
         <w:t>2. Which version was easier to change without breaking something?</w:t>
@@ -652,114 +154,84 @@
     </w:p>
     <w:p>
       <w:r>
-        <w:t>The demo was faster to change: three edits in one file. But it was also easier to break, because the data, the calculation and the chart all live inside the same if run_button: block. One thing that needed care there was the chart label. The original code used labels={"x": "Date", "Close": "Price ($)"}. Once y becomes a list, Plotly melts the columns into "value" and "variable", so a "Close" key no longer matches anything and the axis title falls back to "value". I changed the labels to key on "value" and "variable" instead.</w:t>
+        <w:t>The demo was easier for this one change: every step is already in 06-streamlit-demo.py, so I copied it to demo_modified.py, added sliders and columns, and pointed px.line at three series. Nothing else depended on those column names, and the app still ran on the first try. The class version did not crash either, but I had to keep ma_long_window=None so existing calls still work. The Portfolio tab still does load_stock(ticker, p_start, p_end, p_ma) with no long window; without a default that call would break. The price chart also checks 'MA_long' in stock.data before adding the second trace, because Portfolio Stock objects do not have that column. Those are the kind of coupling issues the demo never surfaces.</w:t>
+      </w:r>
+    </w:p>
+    <w:p>
+      <w:pPr>
+        <w:pStyle w:val="Heading2"/>
+      </w:pPr>
+      <w:r>
+        <w:t>3. Where did the class make the change harder?</w:t>
       </w:r>
     </w:p>
     <w:p>
       <w:r>
-        <w:t>The class version touched more places, but nothing that already worked broke. Because ma_long_window defaults to None, the Portfolio tab's existing call load_stock(ticker, p_start, p_end, p_ma) still ran unchanged and does not compute an extra column it never uses. The easiest mistake to make was updating load_stock() but forgetting the saved settings tuple in st.session_state['single_args'], which would make the new slider do nothing without any error. In both versions, setting the long window to 200 days on a 6-month range leaves MA_long entirely NaN, so that line silently disappears from the chart instead of crashing.</w:t>
+        <w:t>The class forced a design decision the demo never asked me to make: should the second average live on Stock, or should the app compute it from stock.data['Close'] the same way plot_price_ma already builds the Close/MA figure? I put it on the class so a cached Stock already has both series and Tab 1 stays a thin interface. That meant changing the constructor and _calc_ma, then threading a second slider through load_stock:</w:t>
+      </w:r>
+    </w:p>
+    <w:p>
+      <w:r>
+        <w:rPr>
+          <w:rFonts w:ascii="Consolas" w:hAnsi="Consolas"/>
+          <w:color w:val="222222"/>
+          <w:sz w:val="18"/>
+        </w:rPr>
+        <w:t>@st.cache_data(show_spinner=False)</w:t>
+        <w:br/>
+        <w:t>def load_stock(symbol, start, end, ma_window, ma_long_window=None):</w:t>
+        <w:br/>
+        <w:t xml:space="preserve">    return Stock(symbol, start=start, end=end, ma_window=ma_window,</w:t>
+        <w:br/>
+        <w:t xml:space="preserve">                 ma_long_window=ma_long_window)</w:t>
+      </w:r>
+    </w:p>
+    <w:p>
+      <w:r>
+        <w:t>The demo skipped that decision because yfinance, rolling means, and the chart were already in the same script. The harder part of the class was not the math; it was keeping the public Stock API stable while extending it.</w:t>
       </w:r>
     </w:p>
     <w:p>
       <w:pPr>
-        <w:pStyle w:val="Heading1"/>
+        <w:pStyle w:val="Heading2"/>
       </w:pPr>
       <w:r>
-        <w:t>3. Where the class made the change harder or forced a design decision</w:t>
+        <w:t>4. Which version would you rather start from in six months?</w:t>
       </w:r>
     </w:p>
     <w:p>
       <w:r>
-        <w:t>In the demo I could simply write another df[...] = ...rolling(...) line. With the class I had to decide what the public interface of Stock should be. The options were to add a second window argument, to accept a list of windows, or to leave the class alone and create two Stock objects with different ma_window values. Creating two objects would download the same data twice. Computing the MA in the app would put calculation back in the interface, which is exactly what the class is meant to prevent.</w:t>
+        <w:t>I would rather start from the class-based app. If someone asked for a new statistic or another chart of returns, I already have one place to compute it and existing methods to reuse:</w:t>
       </w:r>
     </w:p>
     <w:p>
       <w:r>
-        <w:t>I chose an optional ma_long_window=None argument and a column parameter on _calc_ma(). That keeps every existing call working, keeps the original MA column name that the rest of the app relies on, and reuses one calculation method instead of copying it. The class also forced a caching decision the demo never needed: the new window had to become an argument of the @st.cache_data function so that different long windows are cached separately.</w:t>
+        <w:rPr>
+          <w:rFonts w:ascii="Consolas" w:hAnsi="Consolas"/>
+          <w:color w:val="222222"/>
+          <w:sz w:val="18"/>
+        </w:rPr>
+        <w:t>st.plotly_chart(stock.plot_performance(), use_container_width=True)</w:t>
+        <w:br/>
+        <w:t>st.plotly_chart(stock.plot_return_dist(), use_container_width=True)</w:t>
+      </w:r>
+    </w:p>
+    <w:p>
+      <w:r>
+        <w:t>In the demo, the same request would mean editing get_stock_data, the sidebar, and whichever tab draws the figure, with no shared object to test outside Streamlit. The class is not perfect: plot_price_ma still lives in assignment_1.py because Stock never plotted Close against MA. Even so, I would rather extend stock.py than hunt through a script that downloads, calculates, and renders in one place.</w:t>
       </w:r>
     </w:p>
     <w:p>
       <w:pPr>
-        <w:spacing w:before="80" w:after="160" w:line="240" w:lineRule="auto"/>
-        <w:ind w:left="216"/>
-        <w:shd w:val="clear" w:color="auto" w:fill="F2F2F2"/>
+        <w:pStyle w:val="Heading2"/>
       </w:pPr>
       <w:r>
-        <w:rPr>
-          <w:rFonts w:ascii="Consolas" w:hAnsi="Consolas" w:eastAsia="Consolas"/>
-          <w:sz w:val="18"/>
-        </w:rPr>
-        <w:t>def load_stock(symbol, start, end, ma_window, ma_long_window=None):</w:t>
-      </w:r>
-    </w:p>
-    <w:p>
-      <w:pPr>
-        <w:pStyle w:val="Heading1"/>
-      </w:pPr>
-      <w:r>
-        <w:t>4. Which version would I rather start from in six months?</w:t>
+        <w:t>Portfolio tab: AAPL vs GOOG, last six months</w:t>
       </w:r>
     </w:p>
     <w:p>
       <w:r>
-        <w:t>I would start from the class-based version. Each piece has one clear place: data and calculations are in Stock, and the app only builds interface pieces such as plot_price_ma(stock) and zero_based_performance(stock). A new metric such as volatility would become one method on Stock, and both tabs could use it immediately through load_stock(). Error handling is also already consistent: every tab checks stock.data is None and shows stock.message.</w:t>
-      </w:r>
-    </w:p>
-    <w:p>
-      <w:pPr>
-        <w:keepNext/>
-        <w:spacing w:before="80" w:after="0" w:line="240" w:lineRule="auto"/>
-        <w:ind w:left="216"/>
-        <w:shd w:val="clear" w:color="auto" w:fill="F2F2F2"/>
-      </w:pPr>
-      <w:r>
-        <w:rPr>
-          <w:rFonts w:ascii="Consolas" w:hAnsi="Consolas" w:eastAsia="Consolas"/>
-          <w:sz w:val="18"/>
-        </w:rPr>
-        <w:t>if stock.data is None:</w:t>
-      </w:r>
-    </w:p>
-    <w:p>
-      <w:pPr>
-        <w:keepNext/>
-        <w:spacing w:before="0" w:after="0" w:line="240" w:lineRule="auto"/>
-        <w:ind w:left="216"/>
-        <w:shd w:val="clear" w:color="auto" w:fill="F2F2F2"/>
-      </w:pPr>
-      <w:r>
-        <w:rPr>
-          <w:rFonts w:ascii="Consolas" w:hAnsi="Consolas" w:eastAsia="Consolas"/>
-          <w:sz w:val="18"/>
-        </w:rPr>
-        <w:t xml:space="preserve">    st.error(f'{ticker}: {stock.message}')</w:t>
-      </w:r>
-    </w:p>
-    <w:p>
-      <w:pPr>
-        <w:spacing w:before="0" w:after="160" w:line="240" w:lineRule="auto"/>
-        <w:ind w:left="216"/>
-        <w:shd w:val="clear" w:color="auto" w:fill="F2F2F2"/>
-      </w:pPr>
-      <w:r>
-        <w:rPr>
-          <w:rFonts w:ascii="Consolas" w:hAnsi="Consolas" w:eastAsia="Consolas"/>
-          <w:sz w:val="18"/>
-        </w:rPr>
-        <w:t xml:space="preserve">    continue</w:t>
-      </w:r>
-    </w:p>
-    <w:p>
-      <w:r>
-        <w:t>In the demo, downloading, calculating and plotting are mixed together in one long if run_button: block. Any new feature means reading the whole block to see which DataFrame columns exist at that point. The cost of the class version is that you need to know its column names (change, return, MA, MA_long) and read two files. For anything beyond a quick one-off chart, that cost is worth paying.</w:t>
-      </w:r>
-    </w:p>
-    <w:p>
-      <w:pPr>
-        <w:pStyle w:val="Heading1"/>
-      </w:pPr>
-      <w:r>
-        <w:t>Portfolio comparison: MSFT vs. GOOG (last 6 months)</w:t>
+        <w:t>I compared AAPL and GOOG from late March 2026 through 28 September 2026 on the Portfolio tab. Both zero-based cumulative log-return lines start at exactly 0.0. Over the window Apple finished ahead (about +0.30 versus Google's +0.17), but the lines are not a one-way story. They crossed on 14 July 2026: the day before, AAPL's cumulative log return was 0.2242 and GOOG's was 0.2010; on the 14th AAPL's daily log return was -0.0078 while GOOG's was +0.0188, so Google's line moved to 0.2198 and Apple's fell to 0.2164. In other words the crossing was a down day for Apple together with a strong up day for Google, not a slow drift. The chart below is that Portfolio comparison.</w:t>
       </w:r>
     </w:p>
     <w:p>
@@ -769,7 +241,7 @@
       <w:r>
         <w:drawing>
           <wp:inline xmlns:a="http://schemas.openxmlformats.org/drawingml/2006/main" xmlns:pic="http://schemas.openxmlformats.org/drawingml/2006/picture">
-            <wp:extent cx="5943600" cy="2919663"/>
+            <wp:extent cx="5943600" cy="3090672"/>
             <wp:docPr id="1" name="Picture 1"/>
             <wp:cNvGraphicFramePr>
               <a:graphicFrameLocks noChangeAspect="1"/>
@@ -790,7 +262,7 @@
                   <pic:spPr>
                     <a:xfrm>
                       <a:off x="0" y="0"/>
-                      <a:ext cx="5943600" cy="2919663"/>
+                      <a:ext cx="5943600" cy="3090672"/>
                     </a:xfrm>
                     <a:prstGeom prst="rect"/>
                   </pic:spPr>
@@ -806,21 +278,12 @@
         <w:jc w:val="center"/>
       </w:pPr>
       <w:r>
-        <w:rPr>
-          <w:i/>
-          <w:sz w:val="18"/>
-        </w:rPr>
-        <w:t>Zero-based cumulative log return from the Portfolio tab, 2026-03-28 to 2026-09-28.</w:t>
-      </w:r>
-    </w:p>
-    <w:p>
-      <w:r>
-        <w:t>I compared Microsoft (MSFT) and Alphabet (GOOG) from 2026-03-28 to 2026-09-28. GOOG led for most of the period, peaking near 0.33 cumulative log return in mid-May, while MSFT dipped slightly below zero in late June. The gap narrowed on 2026-07-23, when GOOG's daily return was -0.0714 against MSFT's -0.0227. The lines crossed on 2026-07-30: MSFT's daily return that day was +0.1442 (close $389.81 to $450.25), while GOOG's was -0.0062, taking MSFT from 0.056 to 0.200 and past GOOG at 0.152. GOOG rebounded +0.0666 the next day, but MSFT stayed ahead and finished the period at 0.337 against GOOG's 0.174.</w:t>
+        <w:t>Figure 1. Zero-based cumulative log return, AAPL vs GOOG, last six months. Both series start at 0.0; the lines cross on 14 July 2026.</w:t>
       </w:r>
     </w:p>
     <w:sectPr>
       <w:pgSz w:w="12240" w:h="15840"/>
-      <w:pgMar w:top="1440" w:right="1440" w:bottom="1440" w:left="1440" w:header="720" w:footer="720" w:gutter="0"/>
+      <w:pgMar w:top="1440" w:right="1800" w:bottom="1440" w:left="1800" w:header="720" w:footer="720" w:gutter="0"/>
       <w:cols w:space="720"/>
       <w:docGrid w:linePitch="360"/>
     </w:sectPr>
@@ -1191,9 +654,6 @@
     <w:name w:val="Normal"/>
     <w:qFormat/>
     <w:rsid w:val="00FC693F"/>
-    <w:pPr>
-      <w:spacing w:after="120" w:line="276" w:lineRule="auto"/>
-    </w:pPr>
     <w:rPr>
       <w:rFonts w:ascii="Calibri" w:hAnsi="Calibri"/>
       <w:sz w:val="22"/>

</xml_diff>